<commit_message>
Single output file with all drivers, correct date sorting
- Generate one Word document containing all drivers instead of one per
  driver. Output file named after the uploaded Excel.
- Parse Tarih (date) column via pd.to_datetime before sorting for
  correct chronological order. Display format remains DD.MM.YYYY.
- Each driver's section separated by blank lines.
- Remove zip logic — always one output file.
- Update template to use nested {% for %} loops over drivers and rows.

Co-Authored-By: Claude Haiku 4.5 <noreply@anthropic.com>
</commit_message>
<xml_diff>
--- a/template.docx
+++ b/template.docx
@@ -43,13 +43,18 @@
     </w:p>
     <w:p>
       <w:r>
-        <w:t>Şöför: {{Şöför}}</w:t>
+        <w:t>{% for driver in drivers %}</w:t>
+      </w:r>
+    </w:p>
+    <w:p>
+      <w:r>
+        <w:t>Şöför: {{driver.name}}</w:t>
       </w:r>
     </w:p>
     <w:p/>
     <w:p>
       <w:r>
-        <w:t>{% for row in rows %}</w:t>
+        <w:t>{% for row in driver.rows %}</w:t>
       </w:r>
     </w:p>
     <w:p>
@@ -57,6 +62,12 @@
         <w:t>{{row.Tarih}} - {{row.Saat}} – {{row.Müşteri}} – {{row.To}} =&gt; {{row.From}} – {{row.NumberOfPeople}} – {{row.Kişi}}</w:t>
       </w:r>
     </w:p>
+    <w:p>
+      <w:r>
+        <w:t>{% endfor %}</w:t>
+      </w:r>
+    </w:p>
+    <w:p/>
     <w:p>
       <w:r>
         <w:t>{% endfor %}</w:t>

</xml_diff>

<commit_message>
Flatten output to single sorted row list
- Remove all driver grouping and section headers
- Single Word file with all rows in one flat list
- Global sort by Tarih (parsed as date, not string) then Saat
- Each row format: [Tarih] - [Saat] – [Şöför] – [Müşteri] – [To] =>
  [From] – [X person/people] – [Kişi]
- Output filename based on uploaded Excel
- Simplify template to single {% for %} loop over rows

Co-Authored-By: Claude Haiku 4.5 <noreply@anthropic.com>
</commit_message>
<xml_diff>
--- a/template.docx
+++ b/template.docx
@@ -43,31 +43,14 @@
     </w:p>
     <w:p>
       <w:r>
-        <w:t>{% for driver in drivers %}</w:t>
+        <w:t>{% for row in rows %}</w:t>
       </w:r>
     </w:p>
     <w:p>
       <w:r>
-        <w:t>Şöför: {{driver.name}}</w:t>
+        <w:t>{{row.Tarih}} - {{row.Saat}} – {{row.Şöför}} – {{row.Müşteri}} – {{row.To}} =&gt; {{row.From}} – {{row.NumberOfPeople}} – {{row.Kişi}}</w:t>
       </w:r>
     </w:p>
-    <w:p/>
-    <w:p>
-      <w:r>
-        <w:t>{% for row in driver.rows %}</w:t>
-      </w:r>
-    </w:p>
-    <w:p>
-      <w:r>
-        <w:t>{{row.Tarih}} - {{row.Saat}} – {{row.Müşteri}} – {{row.To}} =&gt; {{row.From}} – {{row.NumberOfPeople}} – {{row.Kişi}}</w:t>
-      </w:r>
-    </w:p>
-    <w:p>
-      <w:r>
-        <w:t>{% endfor %}</w:t>
-      </w:r>
-    </w:p>
-    <w:p/>
     <w:p>
       <w:r>
         <w:t>{% endfor %}</w:t>

</xml_diff>